<commit_message>
Do not circulate Chapter 1 and the table of contents with the invitations
The invitees are being approached before the proposal material is
shared, so the support letter no longer says the signatory has read the
table of contents and sample chapter; it rests on the plan as described
to them, which is what the invitation email now carries. The nine emails
drop the attachment sentence and offer a call in its place. The long-form
templates are marked as the later, post-approval version.

Co-Authored-By: Claude Opus 5 <noreply@anthropic.com>
Claude-Session: https://claude.ai/code/session_01YTsySEafbpGxYLQMAGUGjT
</commit_message>
<xml_diff>
--- a/chapter1/Contributor_Invitation.docx
+++ b/chapter1/Contributor_Invitation.docx
@@ -22,6 +22,55 @@
       </w:r>
       <w:r>
         <w:t xml:space="preserve"> — draft for discussion at the core-author meeting</w:t>
+      </w:r>
+    </w:p>
+    <w:p>
+      <w:pPr>
+        <w:jc w:val="both"/>
+      </w:pPr>
+      <w:r>
+        <w:t xml:space="preserve">&gt; </w:t>
+      </w:r>
+      <w:r>
+        <w:rPr>
+          <w:b/>
+        </w:rPr>
+        <w:t>This is the long form, for later.</w:t>
+      </w:r>
+      <w:r>
+        <w:t xml:space="preserve"> First contact is made with the short emails in</w:t>
+      </w:r>
+    </w:p>
+    <w:p>
+      <w:pPr>
+        <w:jc w:val="both"/>
+      </w:pPr>
+      <w:r>
+        <w:t>&gt; `Invitation_Emails.md`, which describe the invitee's part in a paragraph and attach</w:t>
+      </w:r>
+    </w:p>
+    <w:p>
+      <w:pPr>
+        <w:jc w:val="both"/>
+      </w:pPr>
+      <w:r>
+        <w:t>&gt; nothing but the draft letter of support. Chapter 1 and the annotated table of contents</w:t>
+      </w:r>
+    </w:p>
+    <w:p>
+      <w:pPr>
+        <w:jc w:val="both"/>
+      </w:pPr>
+      <w:r>
+        <w:t>&gt; are not being circulated yet. Use the templates below once the publisher has approved</w:t>
+      </w:r>
+    </w:p>
+    <w:p>
+      <w:pPr>
+        <w:jc w:val="both"/>
+      </w:pPr>
+      <w:r>
+        <w:t>&gt; and the detailed scope is being settled with each contributor.</w:t>
       </w:r>
     </w:p>
     <w:p>

</xml_diff>

<commit_message>
Address the support letter to the editors, not a named person
The proposal may be handled by someone other than the editor we have
corresponded with, so the letter and its template now open 'The Editors,
Wiley-IEEE Press' and 'Dear Editors'. The subject line identifying the
proposal carries the routing instead.

Co-Authored-By: Claude Opus 5 <noreply@anthropic.com>
Claude-Session: https://claude.ai/code/session_01YTsySEafbpGxYLQMAGUGjT
</commit_message>
<xml_diff>
--- a/chapter1/Contributor_Invitation.docx
+++ b/chapter1/Contributor_Invitation.docx
@@ -1096,7 +1096,7 @@
         <w:jc w:val="both"/>
       </w:pPr>
       <w:r>
-        <w:t>To: [Becky Cowan], Wiley-IEEE Press</w:t>
+        <w:t>To: The Editors, Wiley-IEEE Press</w:t>
       </w:r>
     </w:p>
     <w:p>
@@ -1121,7 +1121,7 @@
         <w:jc w:val="both"/>
       </w:pPr>
       <w:r>
-        <w:t>Dear [Ms Cowan],</w:t>
+        <w:t>Dear Editors,</w:t>
       </w:r>
     </w:p>
     <w:p>

</xml_diff>